<commit_message>
Even out the gaps above the CV section headings
The 10pt of space I put above each heading sat on top of whatever space-after
the preceding paragraph happened to carry, which ranged from 1.95pt to 4.95pt,
so the five gaps came out between 11.95pt and 14.95pt. Pin both halves
instead, 4pt after plus 10pt before, for exactly 14pt at every section.
</commit_message>
<xml_diff>
--- a/assets/Pengyu-Jing-CV.docx
+++ b/assets/Pengyu-Jing-CV.docx
@@ -41,7 +41,7 @@
     </w:p>
     <w:p>
       <w:pPr>
-        <w:spacing w:after="39"/>
+        <w:spacing w:after="80"/>
         <w:ind w:left="8"/>
         <w:jc w:val="center"/>
       </w:pPr>
@@ -453,7 +453,7 @@
         <w:tabs>
           <w:tab w:val="right" w:pos="10470"/>
         </w:tabs>
-        <w:spacing w:after="78"/>
+        <w:spacing w:after="80"/>
         <w:ind w:left="-5" w:right="-13" w:hanging="10"/>
       </w:pPr>
       <w:r>
@@ -668,7 +668,7 @@
     </w:p>
     <w:p>
       <w:pPr>
-        <w:spacing w:after="99"/>
+        <w:spacing w:after="80"/>
         <w:ind w:left="12" w:hanging="10"/>
       </w:pPr>
       <w:r>
@@ -1123,7 +1123,7 @@
     </w:p>
     <w:p>
       <w:pPr>
-        <w:spacing w:after="99"/>
+        <w:spacing w:after="80"/>
         <w:ind w:left="-5" w:hanging="10"/>
       </w:pPr>
       <w:r>
@@ -1394,7 +1394,7 @@
           <w:ilvl w:val="0"/>
           <w:numId w:val="2"/>
         </w:numPr>
-        <w:spacing w:after="53"/>
+        <w:spacing w:after="80"/>
         <w:ind w:left="242" w:hanging="240"/>
       </w:pPr>
       <w:r>

</xml_diff>